<commit_message>
Prices typed by the specialist only: remove the price table (Admin → Prices), suggested technicians with prices, and technicians' starting point; drop their columns (migration 0038)
</commit_message>
<xml_diff>
--- a/docs-out/how-be-right-works.docx
+++ b/docs-out/how-be-right-works.docx
@@ -26,7 +26,7 @@
           <w:szCs w:val="18"/>
         </w:rPr>
         <w:ptab w:alignment="right" w:relativeTo="margin" w:leader="none"/>
-        <w:t xml:space="preserve">23 October 2026</w:t>
+        <w:t xml:space="preserve">27 October 2026</w:t>
       </w:r>
     </w:p>
     <w:p>
@@ -112,7 +112,7 @@
           <w:szCs w:val="18"/>
         </w:rPr>
         <w:ptab w:alignment="right" w:relativeTo="margin" w:leader="none"/>
-        <w:t xml:space="preserve">23 October 2026</w:t>
+        <w:t xml:space="preserve">27 October 2026</w:t>
       </w:r>
     </w:p>
     <w:tbl>
@@ -398,7 +398,7 @@
                 <w:sz w:val="19"/>
                 <w:szCs w:val="19"/>
               </w:rPr>
-              <w:t xml:space="preserve">Suggested technicians, each with a price, nearest first</w:t>
+              <w:t xml:space="preserve">Types the price; the customer approves it</w:t>
             </w:r>
           </w:p>
           <w:p>
@@ -434,7 +434,7 @@
                 <w:sz w:val="19"/>
                 <w:szCs w:val="19"/>
               </w:rPr>
-              <w:t xml:space="preserve">Assign (the priced technician is ready) and schedule</w:t>
+              <w:t xml:space="preserve">Assign a technician and schedule</w:t>
             </w:r>
           </w:p>
           <w:p>
@@ -604,7 +604,7 @@
                 <w:sz w:val="19"/>
                 <w:szCs w:val="19"/>
               </w:rPr>
-              <w:t xml:space="preserve">Starting point in My account, used when offline</w:t>
+              <w:t xml:space="preserve">Gets each job by email and in My jobs</w:t>
             </w:r>
           </w:p>
           <w:p>
@@ -792,7 +792,7 @@
                 <w:sz w:val="19"/>
                 <w:szCs w:val="19"/>
               </w:rPr>
-              <w:t xml:space="preserve">Prices: service prices, travel per km, max distance</w:t>
+              <w:t xml:space="preserve">Add a technician by hand, with an account</w:t>
             </w:r>
           </w:p>
           <w:p>
@@ -960,7 +960,7 @@
                 <w:sz w:val="18"/>
                 <w:szCs w:val="18"/>
               </w:rPr>
-              <w:t xml:space="preserve">Service price + travel (rate per km for the technician's transport, times km by road). Rounded up, never below the lowest price or the $10 visit fee. The specialist can change it; the customer sees one total.</w:t>
+              <w:t xml:space="preserve">The specialist types the price after reviewing the request. The customer sees it and approves before anyone is sent: nothing is charged without that yes.</w:t>
             </w:r>
           </w:p>
         </w:tc>
@@ -1034,7 +1034,7 @@
                 <w:sz w:val="21"/>
                 <w:szCs w:val="21"/>
               </w:rPr>
-              <w:t xml:space="preserve">Distance</w:t>
+              <w:t xml:space="preserve">Available</w:t>
             </w:r>
           </w:p>
           <w:p>
@@ -1044,7 +1044,7 @@
                 <w:sz w:val="18"/>
                 <w:szCs w:val="18"/>
               </w:rPr>
-              <w:t xml:space="preserve">From where the technician is when they are Available (online), otherwise from the starting point they set in My account.</w:t>
+              <w:t xml:space="preserve">Technicians go online while they work, so the team sees who is Available. On my way: the customer follows them on the map until they arrive.</w:t>
             </w:r>
           </w:p>
         </w:tc>
@@ -1108,6 +1108,1576 @@
         <w:t xml:space="preserve">Everything works on the website and in the phone app, in English and Arabic. Emails go out at each step once the email service is set up. Payments are not in the app yet.</w:t>
       </w:r>
     </w:p>
+    <w:p>
+      <w:pPr>
+        <w:pageBreakBefore/>
+        <w:pBdr>
+          <w:bottom w:val="single" w:color="000000" w:sz="12"/>
+        </w:pBdr>
+        <w:spacing w:after="100"/>
+      </w:pPr>
+      <w:r>
+        <w:rPr>
+          <w:rFonts w:ascii="Arial" w:cs="Arial" w:eastAsia="Arial" w:hAnsi="Arial"/>
+          <w:b/>
+          <w:bCs/>
+          <w:sz w:val="32"/>
+          <w:szCs w:val="32"/>
+        </w:rPr>
+        <w:t xml:space="preserve">Services (14 + Other)</w:t>
+      </w:r>
+      <w:r>
+        <w:rPr>
+          <w:rFonts w:ascii="Arial" w:cs="Arial" w:eastAsia="Arial" w:hAnsi="Arial"/>
+          <w:sz w:val="18"/>
+          <w:szCs w:val="18"/>
+        </w:rPr>
+        <w:ptab w:alignment="right" w:relativeTo="margin" w:leader="none"/>
+        <w:t xml:space="preserve">27 October 2026</w:t>
+      </w:r>
+    </w:p>
+    <w:p>
+      <w:pPr>
+        <w:spacing w:after="140"/>
+      </w:pPr>
+      <w:r>
+        <w:rPr>
+          <w:rFonts w:ascii="Arial" w:cs="Arial" w:eastAsia="Arial" w:hAnsi="Arial"/>
+          <w:sz w:val="19"/>
+          <w:szCs w:val="19"/>
+        </w:rPr>
+        <w:t xml:space="preserve">What customers can book, as the website shows it, and the questions they answer when booking.</w:t>
+      </w:r>
+    </w:p>
+    <w:tbl>
+      <w:tblPr>
+        <w:tblW w:type="dxa" w:w="15476"/>
+        <w:tblBorders>
+          <w:top w:val="single" w:color="auto" w:sz="4"/>
+          <w:left w:val="single" w:color="auto" w:sz="4"/>
+          <w:bottom w:val="single" w:color="auto" w:sz="4"/>
+          <w:right w:val="single" w:color="auto" w:sz="4"/>
+          <w:insideH w:val="single" w:color="auto" w:sz="4"/>
+          <w:insideV w:val="single" w:color="auto" w:sz="4"/>
+        </w:tblBorders>
+      </w:tblPr>
+      <w:tblGrid>
+        <w:gridCol w:w="2900"/>
+        <w:gridCol w:w="5500"/>
+        <w:gridCol w:w="7076"/>
+      </w:tblGrid>
+      <w:tr>
+        <w:trPr>
+          <w:tblHeader/>
+        </w:trPr>
+        <w:tc>
+          <w:tcPr>
+            <w:tcW w:type="dxa" w:w="2900"/>
+            <w:tcBorders>
+              <w:top w:val="single" w:color="B5B5B5" w:sz="4"/>
+              <w:left w:val="none" w:color="FFFFFF" w:sz="0"/>
+              <w:bottom w:val="single" w:color="B5B5B5" w:sz="4"/>
+              <w:right w:val="none" w:color="FFFFFF" w:sz="0"/>
+            </w:tcBorders>
+            <w:shd w:fill="E6E6E6" w:color="auto" w:val="clear"/>
+            <w:tcMar>
+              <w:top w:type="dxa" w:w="70"/>
+              <w:left w:type="dxa" w:w="100"/>
+              <w:bottom w:type="dxa" w:w="70"/>
+              <w:right w:type="dxa" w:w="100"/>
+            </w:tcMar>
+          </w:tcPr>
+          <w:p>
+            <w:r>
+              <w:rPr>
+                <w:rFonts w:ascii="Arial" w:cs="Arial" w:eastAsia="Arial" w:hAnsi="Arial"/>
+                <w:b/>
+                <w:bCs/>
+                <w:sz w:val="17"/>
+                <w:szCs w:val="17"/>
+              </w:rPr>
+              <w:t xml:space="preserve">Service</w:t>
+            </w:r>
+          </w:p>
+        </w:tc>
+        <w:tc>
+          <w:tcPr>
+            <w:tcW w:type="dxa" w:w="5500"/>
+            <w:tcBorders>
+              <w:top w:val="single" w:color="B5B5B5" w:sz="4"/>
+              <w:left w:val="none" w:color="FFFFFF" w:sz="0"/>
+              <w:bottom w:val="single" w:color="B5B5B5" w:sz="4"/>
+              <w:right w:val="none" w:color="FFFFFF" w:sz="0"/>
+            </w:tcBorders>
+            <w:shd w:fill="E6E6E6" w:color="auto" w:val="clear"/>
+            <w:tcMar>
+              <w:top w:type="dxa" w:w="70"/>
+              <w:left w:type="dxa" w:w="100"/>
+              <w:bottom w:type="dxa" w:w="70"/>
+              <w:right w:type="dxa" w:w="100"/>
+            </w:tcMar>
+          </w:tcPr>
+          <w:p>
+            <w:r>
+              <w:rPr>
+                <w:rFonts w:ascii="Arial" w:cs="Arial" w:eastAsia="Arial" w:hAnsi="Arial"/>
+                <w:b/>
+                <w:bCs/>
+                <w:sz w:val="17"/>
+                <w:szCs w:val="17"/>
+              </w:rPr>
+              <w:t xml:space="preserve">What it covers</w:t>
+            </w:r>
+          </w:p>
+        </w:tc>
+        <w:tc>
+          <w:tcPr>
+            <w:tcW w:type="dxa" w:w="7076"/>
+            <w:tcBorders>
+              <w:top w:val="single" w:color="B5B5B5" w:sz="4"/>
+              <w:left w:val="none" w:color="FFFFFF" w:sz="0"/>
+              <w:bottom w:val="single" w:color="B5B5B5" w:sz="4"/>
+              <w:right w:val="none" w:color="FFFFFF" w:sz="0"/>
+            </w:tcBorders>
+            <w:shd w:fill="E6E6E6" w:color="auto" w:val="clear"/>
+            <w:tcMar>
+              <w:top w:type="dxa" w:w="70"/>
+              <w:left w:type="dxa" w:w="100"/>
+              <w:bottom w:type="dxa" w:w="70"/>
+              <w:right w:type="dxa" w:w="100"/>
+            </w:tcMar>
+          </w:tcPr>
+          <w:p>
+            <w:r>
+              <w:rPr>
+                <w:rFonts w:ascii="Arial" w:cs="Arial" w:eastAsia="Arial" w:hAnsi="Arial"/>
+                <w:b/>
+                <w:bCs/>
+                <w:sz w:val="17"/>
+                <w:szCs w:val="17"/>
+              </w:rPr>
+              <w:t xml:space="preserve">What the customer is asked when booking</w:t>
+            </w:r>
+          </w:p>
+        </w:tc>
+      </w:tr>
+      <w:tr>
+        <w:tc>
+          <w:tcPr>
+            <w:tcW w:type="dxa" w:w="15476"/>
+            <w:gridSpan w:val="3"/>
+            <w:tcBorders>
+              <w:top w:val="single" w:color="B5B5B5" w:sz="4"/>
+              <w:left w:val="none" w:color="FFFFFF" w:sz="0"/>
+              <w:bottom w:val="single" w:color="B5B5B5" w:sz="4"/>
+              <w:right w:val="none" w:color="FFFFFF" w:sz="0"/>
+            </w:tcBorders>
+            <w:tcMar>
+              <w:top w:type="dxa" w:w="70"/>
+              <w:left w:type="dxa" w:w="100"/>
+              <w:bottom w:type="dxa" w:w="70"/>
+              <w:right w:type="dxa" w:w="100"/>
+            </w:tcMar>
+          </w:tcPr>
+          <w:p>
+            <w:r>
+              <w:rPr>
+                <w:rFonts w:ascii="Arial" w:cs="Arial" w:eastAsia="Arial" w:hAnsi="Arial"/>
+                <w:b/>
+                <w:bCs/>
+                <w:sz w:val="19"/>
+                <w:szCs w:val="19"/>
+              </w:rPr>
+              <w:t xml:space="preserve">Trades (9)</w:t>
+            </w:r>
+          </w:p>
+        </w:tc>
+      </w:tr>
+      <w:tr>
+        <w:trPr>
+          <w:cantSplit/>
+        </w:trPr>
+        <w:tc>
+          <w:tcPr>
+            <w:tcW w:type="dxa" w:w="2900"/>
+            <w:tcBorders>
+              <w:top w:val="single" w:color="B5B5B5" w:sz="4"/>
+              <w:left w:val="none" w:color="FFFFFF" w:sz="0"/>
+              <w:bottom w:val="single" w:color="B5B5B5" w:sz="4"/>
+              <w:right w:val="none" w:color="FFFFFF" w:sz="0"/>
+            </w:tcBorders>
+            <w:tcMar>
+              <w:top w:type="dxa" w:w="70"/>
+              <w:left w:type="dxa" w:w="100"/>
+              <w:bottom w:type="dxa" w:w="70"/>
+              <w:right w:type="dxa" w:w="100"/>
+            </w:tcMar>
+          </w:tcPr>
+          <w:p>
+            <w:r>
+              <w:rPr>
+                <w:rFonts w:ascii="Arial" w:cs="Arial" w:eastAsia="Arial" w:hAnsi="Arial"/>
+                <w:b/>
+                <w:bCs/>
+                <w:sz w:val="18"/>
+                <w:szCs w:val="18"/>
+              </w:rPr>
+              <w:t xml:space="preserve">Plumbing</w:t>
+            </w:r>
+          </w:p>
+        </w:tc>
+        <w:tc>
+          <w:tcPr>
+            <w:tcW w:type="dxa" w:w="5500"/>
+            <w:tcBorders>
+              <w:top w:val="single" w:color="B5B5B5" w:sz="4"/>
+              <w:left w:val="none" w:color="FFFFFF" w:sz="0"/>
+              <w:bottom w:val="single" w:color="B5B5B5" w:sz="4"/>
+              <w:right w:val="none" w:color="FFFFFF" w:sz="0"/>
+            </w:tcBorders>
+            <w:tcMar>
+              <w:top w:type="dxa" w:w="70"/>
+              <w:left w:type="dxa" w:w="100"/>
+              <w:bottom w:type="dxa" w:w="70"/>
+              <w:right w:type="dxa" w:w="100"/>
+            </w:tcMar>
+          </w:tcPr>
+          <w:p>
+            <w:r>
+              <w:rPr>
+                <w:rFonts w:ascii="Arial" w:cs="Arial" w:eastAsia="Arial" w:hAnsi="Arial"/>
+                <w:sz w:val="17"/>
+                <w:szCs w:val="17"/>
+              </w:rPr>
+              <w:t xml:space="preserve">Leaks, blocked drains, faucets, toilets, pumps, heaters, water tanks and filters.</w:t>
+            </w:r>
+          </w:p>
+        </w:tc>
+        <w:tc>
+          <w:tcPr>
+            <w:tcW w:type="dxa" w:w="7076"/>
+            <w:tcBorders>
+              <w:top w:val="single" w:color="B5B5B5" w:sz="4"/>
+              <w:left w:val="none" w:color="FFFFFF" w:sz="0"/>
+              <w:bottom w:val="single" w:color="B5B5B5" w:sz="4"/>
+              <w:right w:val="none" w:color="FFFFFF" w:sz="0"/>
+            </w:tcBorders>
+            <w:tcMar>
+              <w:top w:type="dxa" w:w="70"/>
+              <w:left w:type="dxa" w:w="100"/>
+              <w:bottom w:type="dxa" w:w="70"/>
+              <w:right w:type="dxa" w:w="100"/>
+            </w:tcMar>
+          </w:tcPr>
+          <w:p>
+            <w:r>
+              <w:rPr>
+                <w:rFonts w:ascii="Arial" w:cs="Arial" w:eastAsia="Arial" w:hAnsi="Arial"/>
+                <w:sz w:val="17"/>
+                <w:szCs w:val="17"/>
+              </w:rPr>
+              <w:t xml:space="preserve">What is happening? · Where is the leak? · How much water? · Can you stop the water? · Can you see the source?</w:t>
+            </w:r>
+          </w:p>
+        </w:tc>
+      </w:tr>
+      <w:tr>
+        <w:trPr>
+          <w:cantSplit/>
+        </w:trPr>
+        <w:tc>
+          <w:tcPr>
+            <w:tcW w:type="dxa" w:w="2900"/>
+            <w:tcBorders>
+              <w:top w:val="single" w:color="B5B5B5" w:sz="4"/>
+              <w:left w:val="none" w:color="FFFFFF" w:sz="0"/>
+              <w:bottom w:val="single" w:color="B5B5B5" w:sz="4"/>
+              <w:right w:val="none" w:color="FFFFFF" w:sz="0"/>
+            </w:tcBorders>
+            <w:tcMar>
+              <w:top w:type="dxa" w:w="70"/>
+              <w:left w:type="dxa" w:w="100"/>
+              <w:bottom w:type="dxa" w:w="70"/>
+              <w:right w:type="dxa" w:w="100"/>
+            </w:tcMar>
+          </w:tcPr>
+          <w:p>
+            <w:r>
+              <w:rPr>
+                <w:rFonts w:ascii="Arial" w:cs="Arial" w:eastAsia="Arial" w:hAnsi="Arial"/>
+                <w:b/>
+                <w:bCs/>
+                <w:sz w:val="18"/>
+                <w:szCs w:val="18"/>
+              </w:rPr>
+              <w:t xml:space="preserve">Electrical</w:t>
+            </w:r>
+          </w:p>
+        </w:tc>
+        <w:tc>
+          <w:tcPr>
+            <w:tcW w:type="dxa" w:w="5500"/>
+            <w:tcBorders>
+              <w:top w:val="single" w:color="B5B5B5" w:sz="4"/>
+              <w:left w:val="none" w:color="FFFFFF" w:sz="0"/>
+              <w:bottom w:val="single" w:color="B5B5B5" w:sz="4"/>
+              <w:right w:val="none" w:color="FFFFFF" w:sz="0"/>
+            </w:tcBorders>
+            <w:tcMar>
+              <w:top w:type="dxa" w:w="70"/>
+              <w:left w:type="dxa" w:w="100"/>
+              <w:bottom w:type="dxa" w:w="70"/>
+              <w:right w:type="dxa" w:w="100"/>
+            </w:tcMar>
+          </w:tcPr>
+          <w:p>
+            <w:r>
+              <w:rPr>
+                <w:rFonts w:ascii="Arial" w:cs="Arial" w:eastAsia="Arial" w:hAnsi="Arial"/>
+                <w:sz w:val="17"/>
+                <w:szCs w:val="17"/>
+              </w:rPr>
+              <w:t xml:space="preserve">Power faults, lights, sockets, switches and generators.</w:t>
+            </w:r>
+          </w:p>
+        </w:tc>
+        <w:tc>
+          <w:tcPr>
+            <w:tcW w:type="dxa" w:w="7076"/>
+            <w:tcBorders>
+              <w:top w:val="single" w:color="B5B5B5" w:sz="4"/>
+              <w:left w:val="none" w:color="FFFFFF" w:sz="0"/>
+              <w:bottom w:val="single" w:color="B5B5B5" w:sz="4"/>
+              <w:right w:val="none" w:color="FFFFFF" w:sz="0"/>
+            </w:tcBorders>
+            <w:tcMar>
+              <w:top w:type="dxa" w:w="70"/>
+              <w:left w:type="dxa" w:w="100"/>
+              <w:bottom w:type="dxa" w:w="70"/>
+              <w:right w:type="dxa" w:w="100"/>
+            </w:tcMar>
+          </w:tcPr>
+          <w:p>
+            <w:r>
+              <w:rPr>
+                <w:rFonts w:ascii="Arial" w:cs="Arial" w:eastAsia="Arial" w:hAnsi="Arial"/>
+                <w:sz w:val="17"/>
+                <w:szCs w:val="17"/>
+              </w:rPr>
+              <w:t xml:space="preserve">What is happening? · How much of the home is affected? · Any exposed or damaged wiring?</w:t>
+            </w:r>
+          </w:p>
+        </w:tc>
+      </w:tr>
+      <w:tr>
+        <w:trPr>
+          <w:cantSplit/>
+        </w:trPr>
+        <w:tc>
+          <w:tcPr>
+            <w:tcW w:type="dxa" w:w="2900"/>
+            <w:tcBorders>
+              <w:top w:val="single" w:color="B5B5B5" w:sz="4"/>
+              <w:left w:val="none" w:color="FFFFFF" w:sz="0"/>
+              <w:bottom w:val="single" w:color="B5B5B5" w:sz="4"/>
+              <w:right w:val="none" w:color="FFFFFF" w:sz="0"/>
+            </w:tcBorders>
+            <w:tcMar>
+              <w:top w:type="dxa" w:w="70"/>
+              <w:left w:type="dxa" w:w="100"/>
+              <w:bottom w:type="dxa" w:w="70"/>
+              <w:right w:type="dxa" w:w="100"/>
+            </w:tcMar>
+          </w:tcPr>
+          <w:p>
+            <w:r>
+              <w:rPr>
+                <w:rFonts w:ascii="Arial" w:cs="Arial" w:eastAsia="Arial" w:hAnsi="Arial"/>
+                <w:b/>
+                <w:bCs/>
+                <w:sz w:val="18"/>
+                <w:szCs w:val="18"/>
+              </w:rPr>
+              <w:t xml:space="preserve">Air conditioning</w:t>
+            </w:r>
+          </w:p>
+        </w:tc>
+        <w:tc>
+          <w:tcPr>
+            <w:tcW w:type="dxa" w:w="5500"/>
+            <w:tcBorders>
+              <w:top w:val="single" w:color="B5B5B5" w:sz="4"/>
+              <w:left w:val="none" w:color="FFFFFF" w:sz="0"/>
+              <w:bottom w:val="single" w:color="B5B5B5" w:sz="4"/>
+              <w:right w:val="none" w:color="FFFFFF" w:sz="0"/>
+            </w:tcBorders>
+            <w:tcMar>
+              <w:top w:type="dxa" w:w="70"/>
+              <w:left w:type="dxa" w:w="100"/>
+              <w:bottom w:type="dxa" w:w="70"/>
+              <w:right w:type="dxa" w:w="100"/>
+            </w:tcMar>
+          </w:tcPr>
+          <w:p>
+            <w:r>
+              <w:rPr>
+                <w:rFonts w:ascii="Arial" w:cs="Arial" w:eastAsia="Arial" w:hAnsi="Arial"/>
+                <w:sz w:val="17"/>
+                <w:szCs w:val="17"/>
+              </w:rPr>
+              <w:t xml:space="preserve">Cleaning, servicing, installation and repairs.</w:t>
+            </w:r>
+          </w:p>
+        </w:tc>
+        <w:tc>
+          <w:tcPr>
+            <w:tcW w:type="dxa" w:w="7076"/>
+            <w:tcBorders>
+              <w:top w:val="single" w:color="B5B5B5" w:sz="4"/>
+              <w:left w:val="none" w:color="FFFFFF" w:sz="0"/>
+              <w:bottom w:val="single" w:color="B5B5B5" w:sz="4"/>
+              <w:right w:val="none" w:color="FFFFFF" w:sz="0"/>
+            </w:tcBorders>
+            <w:tcMar>
+              <w:top w:type="dxa" w:w="70"/>
+              <w:left w:type="dxa" w:w="100"/>
+              <w:bottom w:type="dxa" w:w="70"/>
+              <w:right w:type="dxa" w:w="100"/>
+            </w:tcMar>
+          </w:tcPr>
+          <w:p>
+            <w:r>
+              <w:rPr>
+                <w:rFonts w:ascii="Arial" w:cs="Arial" w:eastAsia="Arial" w:hAnsi="Arial"/>
+                <w:sz w:val="17"/>
+                <w:szCs w:val="17"/>
+              </w:rPr>
+              <w:t xml:space="preserve">What do you need? · Which type of unit? · How many units?</w:t>
+            </w:r>
+          </w:p>
+        </w:tc>
+      </w:tr>
+      <w:tr>
+        <w:trPr>
+          <w:cantSplit/>
+        </w:trPr>
+        <w:tc>
+          <w:tcPr>
+            <w:tcW w:type="dxa" w:w="2900"/>
+            <w:tcBorders>
+              <w:top w:val="single" w:color="B5B5B5" w:sz="4"/>
+              <w:left w:val="none" w:color="FFFFFF" w:sz="0"/>
+              <w:bottom w:val="single" w:color="B5B5B5" w:sz="4"/>
+              <w:right w:val="none" w:color="FFFFFF" w:sz="0"/>
+            </w:tcBorders>
+            <w:tcMar>
+              <w:top w:type="dxa" w:w="70"/>
+              <w:left w:type="dxa" w:w="100"/>
+              <w:bottom w:type="dxa" w:w="70"/>
+              <w:right w:type="dxa" w:w="100"/>
+            </w:tcMar>
+          </w:tcPr>
+          <w:p>
+            <w:r>
+              <w:rPr>
+                <w:rFonts w:ascii="Arial" w:cs="Arial" w:eastAsia="Arial" w:hAnsi="Arial"/>
+                <w:b/>
+                <w:bCs/>
+                <w:sz w:val="18"/>
+                <w:szCs w:val="18"/>
+              </w:rPr>
+              <w:t xml:space="preserve">Carpentry</w:t>
+            </w:r>
+          </w:p>
+        </w:tc>
+        <w:tc>
+          <w:tcPr>
+            <w:tcW w:type="dxa" w:w="5500"/>
+            <w:tcBorders>
+              <w:top w:val="single" w:color="B5B5B5" w:sz="4"/>
+              <w:left w:val="none" w:color="FFFFFF" w:sz="0"/>
+              <w:bottom w:val="single" w:color="B5B5B5" w:sz="4"/>
+              <w:right w:val="none" w:color="FFFFFF" w:sz="0"/>
+            </w:tcBorders>
+            <w:tcMar>
+              <w:top w:type="dxa" w:w="70"/>
+              <w:left w:type="dxa" w:w="100"/>
+              <w:bottom w:type="dxa" w:w="70"/>
+              <w:right w:type="dxa" w:w="100"/>
+            </w:tcMar>
+          </w:tcPr>
+          <w:p>
+            <w:r>
+              <w:rPr>
+                <w:rFonts w:ascii="Arial" w:cs="Arial" w:eastAsia="Arial" w:hAnsi="Arial"/>
+                <w:sz w:val="17"/>
+                <w:szCs w:val="17"/>
+              </w:rPr>
+              <w:t xml:space="preserve">Doors, cabinets, shelves and furniture repair.</w:t>
+            </w:r>
+          </w:p>
+        </w:tc>
+        <w:tc>
+          <w:tcPr>
+            <w:tcW w:type="dxa" w:w="7076"/>
+            <w:tcBorders>
+              <w:top w:val="single" w:color="B5B5B5" w:sz="4"/>
+              <w:left w:val="none" w:color="FFFFFF" w:sz="0"/>
+              <w:bottom w:val="single" w:color="B5B5B5" w:sz="4"/>
+              <w:right w:val="none" w:color="FFFFFF" w:sz="0"/>
+            </w:tcBorders>
+            <w:tcMar>
+              <w:top w:type="dxa" w:w="70"/>
+              <w:left w:type="dxa" w:w="100"/>
+              <w:bottom w:type="dxa" w:w="70"/>
+              <w:right w:type="dxa" w:w="100"/>
+            </w:tcMar>
+          </w:tcPr>
+          <w:p>
+            <w:r>
+              <w:rPr>
+                <w:rFonts w:ascii="Arial" w:cs="Arial" w:eastAsia="Arial" w:hAnsi="Arial"/>
+                <w:sz w:val="17"/>
+                <w:szCs w:val="17"/>
+              </w:rPr>
+              <w:t xml:space="preserve">What needs work? · Repair or new work?</w:t>
+            </w:r>
+          </w:p>
+        </w:tc>
+      </w:tr>
+      <w:tr>
+        <w:trPr>
+          <w:cantSplit/>
+        </w:trPr>
+        <w:tc>
+          <w:tcPr>
+            <w:tcW w:type="dxa" w:w="2900"/>
+            <w:tcBorders>
+              <w:top w:val="single" w:color="B5B5B5" w:sz="4"/>
+              <w:left w:val="none" w:color="FFFFFF" w:sz="0"/>
+              <w:bottom w:val="single" w:color="B5B5B5" w:sz="4"/>
+              <w:right w:val="none" w:color="FFFFFF" w:sz="0"/>
+            </w:tcBorders>
+            <w:tcMar>
+              <w:top w:type="dxa" w:w="70"/>
+              <w:left w:type="dxa" w:w="100"/>
+              <w:bottom w:type="dxa" w:w="70"/>
+              <w:right w:type="dxa" w:w="100"/>
+            </w:tcMar>
+          </w:tcPr>
+          <w:p>
+            <w:r>
+              <w:rPr>
+                <w:rFonts w:ascii="Arial" w:cs="Arial" w:eastAsia="Arial" w:hAnsi="Arial"/>
+                <w:b/>
+                <w:bCs/>
+                <w:sz w:val="18"/>
+                <w:szCs w:val="18"/>
+              </w:rPr>
+              <w:t xml:space="preserve">Painting &amp; repairs</w:t>
+            </w:r>
+          </w:p>
+        </w:tc>
+        <w:tc>
+          <w:tcPr>
+            <w:tcW w:type="dxa" w:w="5500"/>
+            <w:tcBorders>
+              <w:top w:val="single" w:color="B5B5B5" w:sz="4"/>
+              <w:left w:val="none" w:color="FFFFFF" w:sz="0"/>
+              <w:bottom w:val="single" w:color="B5B5B5" w:sz="4"/>
+              <w:right w:val="none" w:color="FFFFFF" w:sz="0"/>
+            </w:tcBorders>
+            <w:tcMar>
+              <w:top w:type="dxa" w:w="70"/>
+              <w:left w:type="dxa" w:w="100"/>
+              <w:bottom w:type="dxa" w:w="70"/>
+              <w:right w:type="dxa" w:w="100"/>
+            </w:tcMar>
+          </w:tcPr>
+          <w:p>
+            <w:r>
+              <w:rPr>
+                <w:rFonts w:ascii="Arial" w:cs="Arial" w:eastAsia="Arial" w:hAnsi="Arial"/>
+                <w:sz w:val="17"/>
+                <w:szCs w:val="17"/>
+              </w:rPr>
+              <w:t xml:space="preserve">Interior painting, wall repair and minor tiling.</w:t>
+            </w:r>
+          </w:p>
+        </w:tc>
+        <w:tc>
+          <w:tcPr>
+            <w:tcW w:type="dxa" w:w="7076"/>
+            <w:tcBorders>
+              <w:top w:val="single" w:color="B5B5B5" w:sz="4"/>
+              <w:left w:val="none" w:color="FFFFFF" w:sz="0"/>
+              <w:bottom w:val="single" w:color="B5B5B5" w:sz="4"/>
+              <w:right w:val="none" w:color="FFFFFF" w:sz="0"/>
+            </w:tcBorders>
+            <w:tcMar>
+              <w:top w:type="dxa" w:w="70"/>
+              <w:left w:type="dxa" w:w="100"/>
+              <w:bottom w:type="dxa" w:w="70"/>
+              <w:right w:type="dxa" w:w="100"/>
+            </w:tcMar>
+          </w:tcPr>
+          <w:p>
+            <w:r>
+              <w:rPr>
+                <w:rFonts w:ascii="Arial" w:cs="Arial" w:eastAsia="Arial" w:hAnsi="Arial"/>
+                <w:sz w:val="17"/>
+                <w:szCs w:val="17"/>
+              </w:rPr>
+              <w:t xml:space="preserve">How big is the job? · What condition are the walls in?</w:t>
+            </w:r>
+          </w:p>
+        </w:tc>
+      </w:tr>
+      <w:tr>
+        <w:trPr>
+          <w:cantSplit/>
+        </w:trPr>
+        <w:tc>
+          <w:tcPr>
+            <w:tcW w:type="dxa" w:w="2900"/>
+            <w:tcBorders>
+              <w:top w:val="single" w:color="B5B5B5" w:sz="4"/>
+              <w:left w:val="none" w:color="FFFFFF" w:sz="0"/>
+              <w:bottom w:val="single" w:color="B5B5B5" w:sz="4"/>
+              <w:right w:val="none" w:color="FFFFFF" w:sz="0"/>
+            </w:tcBorders>
+            <w:tcMar>
+              <w:top w:type="dxa" w:w="70"/>
+              <w:left w:type="dxa" w:w="100"/>
+              <w:bottom w:type="dxa" w:w="70"/>
+              <w:right w:type="dxa" w:w="100"/>
+            </w:tcMar>
+          </w:tcPr>
+          <w:p>
+            <w:r>
+              <w:rPr>
+                <w:rFonts w:ascii="Arial" w:cs="Arial" w:eastAsia="Arial" w:hAnsi="Arial"/>
+                <w:b/>
+                <w:bCs/>
+                <w:sz w:val="18"/>
+                <w:szCs w:val="18"/>
+              </w:rPr>
+              <w:t xml:space="preserve">Waterproofing</w:t>
+            </w:r>
+          </w:p>
+        </w:tc>
+        <w:tc>
+          <w:tcPr>
+            <w:tcW w:type="dxa" w:w="5500"/>
+            <w:tcBorders>
+              <w:top w:val="single" w:color="B5B5B5" w:sz="4"/>
+              <w:left w:val="none" w:color="FFFFFF" w:sz="0"/>
+              <w:bottom w:val="single" w:color="B5B5B5" w:sz="4"/>
+              <w:right w:val="none" w:color="FFFFFF" w:sz="0"/>
+            </w:tcBorders>
+            <w:tcMar>
+              <w:top w:type="dxa" w:w="70"/>
+              <w:left w:type="dxa" w:w="100"/>
+              <w:bottom w:type="dxa" w:w="70"/>
+              <w:right w:type="dxa" w:w="100"/>
+            </w:tcMar>
+          </w:tcPr>
+          <w:p>
+            <w:r>
+              <w:rPr>
+                <w:rFonts w:ascii="Arial" w:cs="Arial" w:eastAsia="Arial" w:hAnsi="Arial"/>
+                <w:sz w:val="17"/>
+                <w:szCs w:val="17"/>
+              </w:rPr>
+              <w:t xml:space="preserve">Roofs, bathrooms, damp walls, basements and water tanks.</w:t>
+            </w:r>
+          </w:p>
+        </w:tc>
+        <w:tc>
+          <w:tcPr>
+            <w:tcW w:type="dxa" w:w="7076"/>
+            <w:tcBorders>
+              <w:top w:val="single" w:color="B5B5B5" w:sz="4"/>
+              <w:left w:val="none" w:color="FFFFFF" w:sz="0"/>
+              <w:bottom w:val="single" w:color="B5B5B5" w:sz="4"/>
+              <w:right w:val="none" w:color="FFFFFF" w:sz="0"/>
+            </w:tcBorders>
+            <w:tcMar>
+              <w:top w:type="dxa" w:w="70"/>
+              <w:left w:type="dxa" w:w="100"/>
+              <w:bottom w:type="dxa" w:w="70"/>
+              <w:right w:type="dxa" w:w="100"/>
+            </w:tcMar>
+          </w:tcPr>
+          <w:p>
+            <w:r>
+              <w:rPr>
+                <w:rFonts w:ascii="Arial" w:cs="Arial" w:eastAsia="Arial" w:hAnsi="Arial"/>
+                <w:sz w:val="17"/>
+                <w:szCs w:val="17"/>
+              </w:rPr>
+              <w:t xml:space="preserve">Where is the problem? · What do you see now? · How big is the area?</w:t>
+            </w:r>
+          </w:p>
+        </w:tc>
+      </w:tr>
+      <w:tr>
+        <w:trPr>
+          <w:cantSplit/>
+        </w:trPr>
+        <w:tc>
+          <w:tcPr>
+            <w:tcW w:type="dxa" w:w="2900"/>
+            <w:tcBorders>
+              <w:top w:val="single" w:color="B5B5B5" w:sz="4"/>
+              <w:left w:val="none" w:color="FFFFFF" w:sz="0"/>
+              <w:bottom w:val="single" w:color="B5B5B5" w:sz="4"/>
+              <w:right w:val="none" w:color="FFFFFF" w:sz="0"/>
+            </w:tcBorders>
+            <w:tcMar>
+              <w:top w:type="dxa" w:w="70"/>
+              <w:left w:type="dxa" w:w="100"/>
+              <w:bottom w:type="dxa" w:w="70"/>
+              <w:right w:type="dxa" w:w="100"/>
+            </w:tcMar>
+          </w:tcPr>
+          <w:p>
+            <w:r>
+              <w:rPr>
+                <w:rFonts w:ascii="Arial" w:cs="Arial" w:eastAsia="Arial" w:hAnsi="Arial"/>
+                <w:b/>
+                <w:bCs/>
+                <w:sz w:val="18"/>
+                <w:szCs w:val="18"/>
+              </w:rPr>
+              <w:t xml:space="preserve">Installation &amp; assembly</w:t>
+            </w:r>
+          </w:p>
+        </w:tc>
+        <w:tc>
+          <w:tcPr>
+            <w:tcW w:type="dxa" w:w="5500"/>
+            <w:tcBorders>
+              <w:top w:val="single" w:color="B5B5B5" w:sz="4"/>
+              <w:left w:val="none" w:color="FFFFFF" w:sz="0"/>
+              <w:bottom w:val="single" w:color="B5B5B5" w:sz="4"/>
+              <w:right w:val="none" w:color="FFFFFF" w:sz="0"/>
+            </w:tcBorders>
+            <w:tcMar>
+              <w:top w:type="dxa" w:w="70"/>
+              <w:left w:type="dxa" w:w="100"/>
+              <w:bottom w:type="dxa" w:w="70"/>
+              <w:right w:type="dxa" w:w="100"/>
+            </w:tcMar>
+          </w:tcPr>
+          <w:p>
+            <w:r>
+              <w:rPr>
+                <w:rFonts w:ascii="Arial" w:cs="Arial" w:eastAsia="Arial" w:hAnsi="Arial"/>
+                <w:sz w:val="17"/>
+                <w:szCs w:val="17"/>
+              </w:rPr>
+              <w:t xml:space="preserve">Furniture assembly, TV mounting, curtains and blinds, shelves and mirrors.</w:t>
+            </w:r>
+          </w:p>
+        </w:tc>
+        <w:tc>
+          <w:tcPr>
+            <w:tcW w:type="dxa" w:w="7076"/>
+            <w:tcBorders>
+              <w:top w:val="single" w:color="B5B5B5" w:sz="4"/>
+              <w:left w:val="none" w:color="FFFFFF" w:sz="0"/>
+              <w:bottom w:val="single" w:color="B5B5B5" w:sz="4"/>
+              <w:right w:val="none" w:color="FFFFFF" w:sz="0"/>
+            </w:tcBorders>
+            <w:tcMar>
+              <w:top w:type="dxa" w:w="70"/>
+              <w:left w:type="dxa" w:w="100"/>
+              <w:bottom w:type="dxa" w:w="70"/>
+              <w:right w:type="dxa" w:w="100"/>
+            </w:tcMar>
+          </w:tcPr>
+          <w:p>
+            <w:r>
+              <w:rPr>
+                <w:rFonts w:ascii="Arial" w:cs="Arial" w:eastAsia="Arial" w:hAnsi="Arial"/>
+                <w:sz w:val="17"/>
+                <w:szCs w:val="17"/>
+              </w:rPr>
+              <w:t xml:space="preserve">What needs installing? · How many items? · Do you have the parts and fixings?</w:t>
+            </w:r>
+          </w:p>
+        </w:tc>
+      </w:tr>
+      <w:tr>
+        <w:trPr>
+          <w:cantSplit/>
+        </w:trPr>
+        <w:tc>
+          <w:tcPr>
+            <w:tcW w:type="dxa" w:w="2900"/>
+            <w:tcBorders>
+              <w:top w:val="single" w:color="B5B5B5" w:sz="4"/>
+              <w:left w:val="none" w:color="FFFFFF" w:sz="0"/>
+              <w:bottom w:val="single" w:color="B5B5B5" w:sz="4"/>
+              <w:right w:val="none" w:color="FFFFFF" w:sz="0"/>
+            </w:tcBorders>
+            <w:tcMar>
+              <w:top w:type="dxa" w:w="70"/>
+              <w:left w:type="dxa" w:w="100"/>
+              <w:bottom w:type="dxa" w:w="70"/>
+              <w:right w:type="dxa" w:w="100"/>
+            </w:tcMar>
+          </w:tcPr>
+          <w:p>
+            <w:r>
+              <w:rPr>
+                <w:rFonts w:ascii="Arial" w:cs="Arial" w:eastAsia="Arial" w:hAnsi="Arial"/>
+                <w:b/>
+                <w:bCs/>
+                <w:sz w:val="18"/>
+                <w:szCs w:val="18"/>
+              </w:rPr>
+              <w:t xml:space="preserve">Locksmith</w:t>
+            </w:r>
+          </w:p>
+        </w:tc>
+        <w:tc>
+          <w:tcPr>
+            <w:tcW w:type="dxa" w:w="5500"/>
+            <w:tcBorders>
+              <w:top w:val="single" w:color="B5B5B5" w:sz="4"/>
+              <w:left w:val="none" w:color="FFFFFF" w:sz="0"/>
+              <w:bottom w:val="single" w:color="B5B5B5" w:sz="4"/>
+              <w:right w:val="none" w:color="FFFFFF" w:sz="0"/>
+            </w:tcBorders>
+            <w:tcMar>
+              <w:top w:type="dxa" w:w="70"/>
+              <w:left w:type="dxa" w:w="100"/>
+              <w:bottom w:type="dxa" w:w="70"/>
+              <w:right w:type="dxa" w:w="100"/>
+            </w:tcMar>
+          </w:tcPr>
+          <w:p>
+            <w:r>
+              <w:rPr>
+                <w:rFonts w:ascii="Arial" w:cs="Arial" w:eastAsia="Arial" w:hAnsi="Arial"/>
+                <w:sz w:val="17"/>
+                <w:szCs w:val="17"/>
+              </w:rPr>
+              <w:t xml:space="preserve">Lockouts, locks and keys for homes, businesses and cars.</w:t>
+            </w:r>
+          </w:p>
+        </w:tc>
+        <w:tc>
+          <w:tcPr>
+            <w:tcW w:type="dxa" w:w="7076"/>
+            <w:tcBorders>
+              <w:top w:val="single" w:color="B5B5B5" w:sz="4"/>
+              <w:left w:val="none" w:color="FFFFFF" w:sz="0"/>
+              <w:bottom w:val="single" w:color="B5B5B5" w:sz="4"/>
+              <w:right w:val="none" w:color="FFFFFF" w:sz="0"/>
+            </w:tcBorders>
+            <w:tcMar>
+              <w:top w:type="dxa" w:w="70"/>
+              <w:left w:type="dxa" w:w="100"/>
+              <w:bottom w:type="dxa" w:w="70"/>
+              <w:right w:type="dxa" w:w="100"/>
+            </w:tcMar>
+          </w:tcPr>
+          <w:p>
+            <w:r>
+              <w:rPr>
+                <w:rFonts w:ascii="Arial" w:cs="Arial" w:eastAsia="Arial" w:hAnsi="Arial"/>
+                <w:sz w:val="17"/>
+                <w:szCs w:val="17"/>
+              </w:rPr>
+              <w:t xml:space="preserve">What do you need? · Is anyone stuck inside?</w:t>
+            </w:r>
+          </w:p>
+        </w:tc>
+      </w:tr>
+      <w:tr>
+        <w:trPr>
+          <w:cantSplit/>
+        </w:trPr>
+        <w:tc>
+          <w:tcPr>
+            <w:tcW w:type="dxa" w:w="2900"/>
+            <w:tcBorders>
+              <w:top w:val="single" w:color="B5B5B5" w:sz="4"/>
+              <w:left w:val="none" w:color="FFFFFF" w:sz="0"/>
+              <w:bottom w:val="single" w:color="B5B5B5" w:sz="4"/>
+              <w:right w:val="none" w:color="FFFFFF" w:sz="0"/>
+            </w:tcBorders>
+            <w:tcMar>
+              <w:top w:type="dxa" w:w="70"/>
+              <w:left w:type="dxa" w:w="100"/>
+              <w:bottom w:type="dxa" w:w="70"/>
+              <w:right w:type="dxa" w:w="100"/>
+            </w:tcMar>
+          </w:tcPr>
+          <w:p>
+            <w:r>
+              <w:rPr>
+                <w:rFonts w:ascii="Arial" w:cs="Arial" w:eastAsia="Arial" w:hAnsi="Arial"/>
+                <w:b/>
+                <w:bCs/>
+                <w:sz w:val="18"/>
+                <w:szCs w:val="18"/>
+              </w:rPr>
+              <w:t xml:space="preserve">Cameras &amp; alarms</w:t>
+            </w:r>
+          </w:p>
+        </w:tc>
+        <w:tc>
+          <w:tcPr>
+            <w:tcW w:type="dxa" w:w="5500"/>
+            <w:tcBorders>
+              <w:top w:val="single" w:color="B5B5B5" w:sz="4"/>
+              <w:left w:val="none" w:color="FFFFFF" w:sz="0"/>
+              <w:bottom w:val="single" w:color="B5B5B5" w:sz="4"/>
+              <w:right w:val="none" w:color="FFFFFF" w:sz="0"/>
+            </w:tcBorders>
+            <w:tcMar>
+              <w:top w:type="dxa" w:w="70"/>
+              <w:left w:type="dxa" w:w="100"/>
+              <w:bottom w:type="dxa" w:w="70"/>
+              <w:right w:type="dxa" w:w="100"/>
+            </w:tcMar>
+          </w:tcPr>
+          <w:p>
+            <w:r>
+              <w:rPr>
+                <w:rFonts w:ascii="Arial" w:cs="Arial" w:eastAsia="Arial" w:hAnsi="Arial"/>
+                <w:sz w:val="17"/>
+                <w:szCs w:val="17"/>
+              </w:rPr>
+              <w:t xml:space="preserve">Security cameras, alarm systems and intercoms: installation and repair.</w:t>
+            </w:r>
+          </w:p>
+        </w:tc>
+        <w:tc>
+          <w:tcPr>
+            <w:tcW w:type="dxa" w:w="7076"/>
+            <w:tcBorders>
+              <w:top w:val="single" w:color="B5B5B5" w:sz="4"/>
+              <w:left w:val="none" w:color="FFFFFF" w:sz="0"/>
+              <w:bottom w:val="single" w:color="B5B5B5" w:sz="4"/>
+              <w:right w:val="none" w:color="FFFFFF" w:sz="0"/>
+            </w:tcBorders>
+            <w:tcMar>
+              <w:top w:type="dxa" w:w="70"/>
+              <w:left w:type="dxa" w:w="100"/>
+              <w:bottom w:type="dxa" w:w="70"/>
+              <w:right w:type="dxa" w:w="100"/>
+            </w:tcMar>
+          </w:tcPr>
+          <w:p>
+            <w:r>
+              <w:rPr>
+                <w:rFonts w:ascii="Arial" w:cs="Arial" w:eastAsia="Arial" w:hAnsi="Arial"/>
+                <w:sz w:val="17"/>
+                <w:szCs w:val="17"/>
+              </w:rPr>
+              <w:t xml:space="preserve">Which system? · What do you need? · How many cameras or sensors?</w:t>
+            </w:r>
+          </w:p>
+        </w:tc>
+      </w:tr>
+      <w:tr>
+        <w:tc>
+          <w:tcPr>
+            <w:tcW w:type="dxa" w:w="15476"/>
+            <w:gridSpan w:val="3"/>
+            <w:tcBorders>
+              <w:top w:val="single" w:color="B5B5B5" w:sz="4"/>
+              <w:left w:val="none" w:color="FFFFFF" w:sz="0"/>
+              <w:bottom w:val="single" w:color="B5B5B5" w:sz="4"/>
+              <w:right w:val="none" w:color="FFFFFF" w:sz="0"/>
+            </w:tcBorders>
+            <w:tcMar>
+              <w:top w:type="dxa" w:w="70"/>
+              <w:left w:type="dxa" w:w="100"/>
+              <w:bottom w:type="dxa" w:w="70"/>
+              <w:right w:type="dxa" w:w="100"/>
+            </w:tcMar>
+          </w:tcPr>
+          <w:p>
+            <w:r>
+              <w:rPr>
+                <w:rFonts w:ascii="Arial" w:cs="Arial" w:eastAsia="Arial" w:hAnsi="Arial"/>
+                <w:b/>
+                <w:bCs/>
+                <w:sz w:val="19"/>
+                <w:szCs w:val="19"/>
+              </w:rPr>
+              <w:t xml:space="preserve">Facility services (5)</w:t>
+            </w:r>
+          </w:p>
+        </w:tc>
+      </w:tr>
+      <w:tr>
+        <w:trPr>
+          <w:cantSplit/>
+        </w:trPr>
+        <w:tc>
+          <w:tcPr>
+            <w:tcW w:type="dxa" w:w="2900"/>
+            <w:tcBorders>
+              <w:top w:val="single" w:color="B5B5B5" w:sz="4"/>
+              <w:left w:val="none" w:color="FFFFFF" w:sz="0"/>
+              <w:bottom w:val="single" w:color="B5B5B5" w:sz="4"/>
+              <w:right w:val="none" w:color="FFFFFF" w:sz="0"/>
+            </w:tcBorders>
+            <w:tcMar>
+              <w:top w:type="dxa" w:w="70"/>
+              <w:left w:type="dxa" w:w="100"/>
+              <w:bottom w:type="dxa" w:w="70"/>
+              <w:right w:type="dxa" w:w="100"/>
+            </w:tcMar>
+          </w:tcPr>
+          <w:p>
+            <w:r>
+              <w:rPr>
+                <w:rFonts w:ascii="Arial" w:cs="Arial" w:eastAsia="Arial" w:hAnsi="Arial"/>
+                <w:b/>
+                <w:bCs/>
+                <w:sz w:val="18"/>
+                <w:szCs w:val="18"/>
+              </w:rPr>
+              <w:t xml:space="preserve">Cleaning</w:t>
+            </w:r>
+          </w:p>
+        </w:tc>
+        <w:tc>
+          <w:tcPr>
+            <w:tcW w:type="dxa" w:w="5500"/>
+            <w:tcBorders>
+              <w:top w:val="single" w:color="B5B5B5" w:sz="4"/>
+              <w:left w:val="none" w:color="FFFFFF" w:sz="0"/>
+              <w:bottom w:val="single" w:color="B5B5B5" w:sz="4"/>
+              <w:right w:val="none" w:color="FFFFFF" w:sz="0"/>
+            </w:tcBorders>
+            <w:tcMar>
+              <w:top w:type="dxa" w:w="70"/>
+              <w:left w:type="dxa" w:w="100"/>
+              <w:bottom w:type="dxa" w:w="70"/>
+              <w:right w:type="dxa" w:w="100"/>
+            </w:tcMar>
+          </w:tcPr>
+          <w:p>
+            <w:r>
+              <w:rPr>
+                <w:rFonts w:ascii="Arial" w:cs="Arial" w:eastAsia="Arial" w:hAnsi="Arial"/>
+                <w:sz w:val="17"/>
+                <w:szCs w:val="17"/>
+              </w:rPr>
+              <w:t xml:space="preserve">Home, office, deep and post-construction cleaning.</w:t>
+            </w:r>
+          </w:p>
+        </w:tc>
+        <w:tc>
+          <w:tcPr>
+            <w:tcW w:type="dxa" w:w="7076"/>
+            <w:tcBorders>
+              <w:top w:val="single" w:color="B5B5B5" w:sz="4"/>
+              <w:left w:val="none" w:color="FFFFFF" w:sz="0"/>
+              <w:bottom w:val="single" w:color="B5B5B5" w:sz="4"/>
+              <w:right w:val="none" w:color="FFFFFF" w:sz="0"/>
+            </w:tcBorders>
+            <w:tcMar>
+              <w:top w:type="dxa" w:w="70"/>
+              <w:left w:type="dxa" w:w="100"/>
+              <w:bottom w:type="dxa" w:w="70"/>
+              <w:right w:type="dxa" w:w="100"/>
+            </w:tcMar>
+          </w:tcPr>
+          <w:p>
+            <w:r>
+              <w:rPr>
+                <w:rFonts w:ascii="Arial" w:cs="Arial" w:eastAsia="Arial" w:hAnsi="Arial"/>
+                <w:sz w:val="17"/>
+                <w:szCs w:val="17"/>
+              </w:rPr>
+              <w:t xml:space="preserve">What kind of cleaning? · How big is the place? · One-time or recurring?</w:t>
+            </w:r>
+          </w:p>
+        </w:tc>
+      </w:tr>
+      <w:tr>
+        <w:trPr>
+          <w:cantSplit/>
+        </w:trPr>
+        <w:tc>
+          <w:tcPr>
+            <w:tcW w:type="dxa" w:w="2900"/>
+            <w:tcBorders>
+              <w:top w:val="single" w:color="B5B5B5" w:sz="4"/>
+              <w:left w:val="none" w:color="FFFFFF" w:sz="0"/>
+              <w:bottom w:val="single" w:color="B5B5B5" w:sz="4"/>
+              <w:right w:val="none" w:color="FFFFFF" w:sz="0"/>
+            </w:tcBorders>
+            <w:tcMar>
+              <w:top w:type="dxa" w:w="70"/>
+              <w:left w:type="dxa" w:w="100"/>
+              <w:bottom w:type="dxa" w:w="70"/>
+              <w:right w:type="dxa" w:w="100"/>
+            </w:tcMar>
+          </w:tcPr>
+          <w:p>
+            <w:r>
+              <w:rPr>
+                <w:rFonts w:ascii="Arial" w:cs="Arial" w:eastAsia="Arial" w:hAnsi="Arial"/>
+                <w:b/>
+                <w:bCs/>
+                <w:sz w:val="18"/>
+                <w:szCs w:val="18"/>
+              </w:rPr>
+              <w:t xml:space="preserve">Guard</w:t>
+            </w:r>
+          </w:p>
+        </w:tc>
+        <w:tc>
+          <w:tcPr>
+            <w:tcW w:type="dxa" w:w="5500"/>
+            <w:tcBorders>
+              <w:top w:val="single" w:color="B5B5B5" w:sz="4"/>
+              <w:left w:val="none" w:color="FFFFFF" w:sz="0"/>
+              <w:bottom w:val="single" w:color="B5B5B5" w:sz="4"/>
+              <w:right w:val="none" w:color="FFFFFF" w:sz="0"/>
+            </w:tcBorders>
+            <w:tcMar>
+              <w:top w:type="dxa" w:w="70"/>
+              <w:left w:type="dxa" w:w="100"/>
+              <w:bottom w:type="dxa" w:w="70"/>
+              <w:right w:type="dxa" w:w="100"/>
+            </w:tcMar>
+          </w:tcPr>
+          <w:p>
+            <w:r>
+              <w:rPr>
+                <w:rFonts w:ascii="Arial" w:cs="Arial" w:eastAsia="Arial" w:hAnsi="Arial"/>
+                <w:sz w:val="17"/>
+                <w:szCs w:val="17"/>
+              </w:rPr>
+              <w:t xml:space="preserve">Guards for buildings, sites and events.</w:t>
+            </w:r>
+          </w:p>
+        </w:tc>
+        <w:tc>
+          <w:tcPr>
+            <w:tcW w:type="dxa" w:w="7076"/>
+            <w:tcBorders>
+              <w:top w:val="single" w:color="B5B5B5" w:sz="4"/>
+              <w:left w:val="none" w:color="FFFFFF" w:sz="0"/>
+              <w:bottom w:val="single" w:color="B5B5B5" w:sz="4"/>
+              <w:right w:val="none" w:color="FFFFFF" w:sz="0"/>
+            </w:tcBorders>
+            <w:tcMar>
+              <w:top w:type="dxa" w:w="70"/>
+              <w:left w:type="dxa" w:w="100"/>
+              <w:bottom w:type="dxa" w:w="70"/>
+              <w:right w:type="dxa" w:w="100"/>
+            </w:tcMar>
+          </w:tcPr>
+          <w:p>
+            <w:r>
+              <w:rPr>
+                <w:rFonts w:ascii="Arial" w:cs="Arial" w:eastAsia="Arial" w:hAnsi="Arial"/>
+                <w:sz w:val="17"/>
+                <w:szCs w:val="17"/>
+              </w:rPr>
+              <w:t xml:space="preserve">What needs guarding? · Which hours? · How many guards?</w:t>
+            </w:r>
+          </w:p>
+        </w:tc>
+      </w:tr>
+      <w:tr>
+        <w:trPr>
+          <w:cantSplit/>
+        </w:trPr>
+        <w:tc>
+          <w:tcPr>
+            <w:tcW w:type="dxa" w:w="2900"/>
+            <w:tcBorders>
+              <w:top w:val="single" w:color="B5B5B5" w:sz="4"/>
+              <w:left w:val="none" w:color="FFFFFF" w:sz="0"/>
+              <w:bottom w:val="single" w:color="B5B5B5" w:sz="4"/>
+              <w:right w:val="none" w:color="FFFFFF" w:sz="0"/>
+            </w:tcBorders>
+            <w:tcMar>
+              <w:top w:type="dxa" w:w="70"/>
+              <w:left w:type="dxa" w:w="100"/>
+              <w:bottom w:type="dxa" w:w="70"/>
+              <w:right w:type="dxa" w:w="100"/>
+            </w:tcMar>
+          </w:tcPr>
+          <w:p>
+            <w:r>
+              <w:rPr>
+                <w:rFonts w:ascii="Arial" w:cs="Arial" w:eastAsia="Arial" w:hAnsi="Arial"/>
+                <w:b/>
+                <w:bCs/>
+                <w:sz w:val="18"/>
+                <w:szCs w:val="18"/>
+              </w:rPr>
+              <w:t xml:space="preserve">Valet &amp; event staff</w:t>
+            </w:r>
+          </w:p>
+        </w:tc>
+        <w:tc>
+          <w:tcPr>
+            <w:tcW w:type="dxa" w:w="5500"/>
+            <w:tcBorders>
+              <w:top w:val="single" w:color="B5B5B5" w:sz="4"/>
+              <w:left w:val="none" w:color="FFFFFF" w:sz="0"/>
+              <w:bottom w:val="single" w:color="B5B5B5" w:sz="4"/>
+              <w:right w:val="none" w:color="FFFFFF" w:sz="0"/>
+            </w:tcBorders>
+            <w:tcMar>
+              <w:top w:type="dxa" w:w="70"/>
+              <w:left w:type="dxa" w:w="100"/>
+              <w:bottom w:type="dxa" w:w="70"/>
+              <w:right w:type="dxa" w:w="100"/>
+            </w:tcMar>
+          </w:tcPr>
+          <w:p>
+            <w:r>
+              <w:rPr>
+                <w:rFonts w:ascii="Arial" w:cs="Arial" w:eastAsia="Arial" w:hAnsi="Arial"/>
+                <w:sz w:val="17"/>
+                <w:szCs w:val="17"/>
+              </w:rPr>
+              <w:t xml:space="preserve">Staff for restaurants, venues and events.</w:t>
+            </w:r>
+          </w:p>
+        </w:tc>
+        <w:tc>
+          <w:tcPr>
+            <w:tcW w:type="dxa" w:w="7076"/>
+            <w:tcBorders>
+              <w:top w:val="single" w:color="B5B5B5" w:sz="4"/>
+              <w:left w:val="none" w:color="FFFFFF" w:sz="0"/>
+              <w:bottom w:val="single" w:color="B5B5B5" w:sz="4"/>
+              <w:right w:val="none" w:color="FFFFFF" w:sz="0"/>
+            </w:tcBorders>
+            <w:tcMar>
+              <w:top w:type="dxa" w:w="70"/>
+              <w:left w:type="dxa" w:w="100"/>
+              <w:bottom w:type="dxa" w:w="70"/>
+              <w:right w:type="dxa" w:w="100"/>
+            </w:tcMar>
+          </w:tcPr>
+          <w:p>
+            <w:r>
+              <w:rPr>
+                <w:rFonts w:ascii="Arial" w:cs="Arial" w:eastAsia="Arial" w:hAnsi="Arial"/>
+                <w:sz w:val="17"/>
+                <w:szCs w:val="17"/>
+              </w:rPr>
+              <w:t xml:space="preserve">Where is the job? · How many staff? · Which shift?</w:t>
+            </w:r>
+          </w:p>
+        </w:tc>
+      </w:tr>
+      <w:tr>
+        <w:trPr>
+          <w:cantSplit/>
+        </w:trPr>
+        <w:tc>
+          <w:tcPr>
+            <w:tcW w:type="dxa" w:w="2900"/>
+            <w:tcBorders>
+              <w:top w:val="single" w:color="B5B5B5" w:sz="4"/>
+              <w:left w:val="none" w:color="FFFFFF" w:sz="0"/>
+              <w:bottom w:val="single" w:color="B5B5B5" w:sz="4"/>
+              <w:right w:val="none" w:color="FFFFFF" w:sz="0"/>
+            </w:tcBorders>
+            <w:tcMar>
+              <w:top w:type="dxa" w:w="70"/>
+              <w:left w:type="dxa" w:w="100"/>
+              <w:bottom w:type="dxa" w:w="70"/>
+              <w:right w:type="dxa" w:w="100"/>
+            </w:tcMar>
+          </w:tcPr>
+          <w:p>
+            <w:r>
+              <w:rPr>
+                <w:rFonts w:ascii="Arial" w:cs="Arial" w:eastAsia="Arial" w:hAnsi="Arial"/>
+                <w:b/>
+                <w:bCs/>
+                <w:sz w:val="18"/>
+                <w:szCs w:val="18"/>
+              </w:rPr>
+              <w:t xml:space="preserve">Porter</w:t>
+            </w:r>
+          </w:p>
+        </w:tc>
+        <w:tc>
+          <w:tcPr>
+            <w:tcW w:type="dxa" w:w="5500"/>
+            <w:tcBorders>
+              <w:top w:val="single" w:color="B5B5B5" w:sz="4"/>
+              <w:left w:val="none" w:color="FFFFFF" w:sz="0"/>
+              <w:bottom w:val="single" w:color="B5B5B5" w:sz="4"/>
+              <w:right w:val="none" w:color="FFFFFF" w:sz="0"/>
+            </w:tcBorders>
+            <w:tcMar>
+              <w:top w:type="dxa" w:w="70"/>
+              <w:left w:type="dxa" w:w="100"/>
+              <w:bottom w:type="dxa" w:w="70"/>
+              <w:right w:type="dxa" w:w="100"/>
+            </w:tcMar>
+          </w:tcPr>
+          <w:p>
+            <w:r>
+              <w:rPr>
+                <w:rFonts w:ascii="Arial" w:cs="Arial" w:eastAsia="Arial" w:hAnsi="Arial"/>
+                <w:sz w:val="17"/>
+                <w:szCs w:val="17"/>
+              </w:rPr>
+              <w:t xml:space="preserve">Carrying, moving assistance and building support.</w:t>
+            </w:r>
+          </w:p>
+        </w:tc>
+        <w:tc>
+          <w:tcPr>
+            <w:tcW w:type="dxa" w:w="7076"/>
+            <w:tcBorders>
+              <w:top w:val="single" w:color="B5B5B5" w:sz="4"/>
+              <w:left w:val="none" w:color="FFFFFF" w:sz="0"/>
+              <w:bottom w:val="single" w:color="B5B5B5" w:sz="4"/>
+              <w:right w:val="none" w:color="FFFFFF" w:sz="0"/>
+            </w:tcBorders>
+            <w:tcMar>
+              <w:top w:type="dxa" w:w="70"/>
+              <w:left w:type="dxa" w:w="100"/>
+              <w:bottom w:type="dxa" w:w="70"/>
+              <w:right w:type="dxa" w:w="100"/>
+            </w:tcMar>
+          </w:tcPr>
+          <w:p>
+            <w:r>
+              <w:rPr>
+                <w:rFonts w:ascii="Arial" w:cs="Arial" w:eastAsia="Arial" w:hAnsi="Arial"/>
+                <w:sz w:val="17"/>
+                <w:szCs w:val="17"/>
+              </w:rPr>
+              <w:t xml:space="preserve">What do you need? · For how long? · Stairs or elevator?</w:t>
+            </w:r>
+          </w:p>
+        </w:tc>
+      </w:tr>
+      <w:tr>
+        <w:trPr>
+          <w:cantSplit/>
+        </w:trPr>
+        <w:tc>
+          <w:tcPr>
+            <w:tcW w:type="dxa" w:w="2900"/>
+            <w:tcBorders>
+              <w:top w:val="single" w:color="B5B5B5" w:sz="4"/>
+              <w:left w:val="none" w:color="FFFFFF" w:sz="0"/>
+              <w:bottom w:val="single" w:color="B5B5B5" w:sz="4"/>
+              <w:right w:val="none" w:color="FFFFFF" w:sz="0"/>
+            </w:tcBorders>
+            <w:tcMar>
+              <w:top w:type="dxa" w:w="70"/>
+              <w:left w:type="dxa" w:w="100"/>
+              <w:bottom w:type="dxa" w:w="70"/>
+              <w:right w:type="dxa" w:w="100"/>
+            </w:tcMar>
+          </w:tcPr>
+          <w:p>
+            <w:r>
+              <w:rPr>
+                <w:rFonts w:ascii="Arial" w:cs="Arial" w:eastAsia="Arial" w:hAnsi="Arial"/>
+                <w:b/>
+                <w:bCs/>
+                <w:sz w:val="18"/>
+                <w:szCs w:val="18"/>
+              </w:rPr>
+              <w:t xml:space="preserve">Landscaping</w:t>
+            </w:r>
+          </w:p>
+        </w:tc>
+        <w:tc>
+          <w:tcPr>
+            <w:tcW w:type="dxa" w:w="5500"/>
+            <w:tcBorders>
+              <w:top w:val="single" w:color="B5B5B5" w:sz="4"/>
+              <w:left w:val="none" w:color="FFFFFF" w:sz="0"/>
+              <w:bottom w:val="single" w:color="B5B5B5" w:sz="4"/>
+              <w:right w:val="none" w:color="FFFFFF" w:sz="0"/>
+            </w:tcBorders>
+            <w:tcMar>
+              <w:top w:type="dxa" w:w="70"/>
+              <w:left w:type="dxa" w:w="100"/>
+              <w:bottom w:type="dxa" w:w="70"/>
+              <w:right w:type="dxa" w:w="100"/>
+            </w:tcMar>
+          </w:tcPr>
+          <w:p>
+            <w:r>
+              <w:rPr>
+                <w:rFonts w:ascii="Arial" w:cs="Arial" w:eastAsia="Arial" w:hAnsi="Arial"/>
+                <w:sz w:val="17"/>
+                <w:szCs w:val="17"/>
+              </w:rPr>
+              <w:t xml:space="preserve">Gardens, irrigation, tree trimming, fences and outdoor care.</w:t>
+            </w:r>
+          </w:p>
+        </w:tc>
+        <w:tc>
+          <w:tcPr>
+            <w:tcW w:type="dxa" w:w="7076"/>
+            <w:tcBorders>
+              <w:top w:val="single" w:color="B5B5B5" w:sz="4"/>
+              <w:left w:val="none" w:color="FFFFFF" w:sz="0"/>
+              <w:bottom w:val="single" w:color="B5B5B5" w:sz="4"/>
+              <w:right w:val="none" w:color="FFFFFF" w:sz="0"/>
+            </w:tcBorders>
+            <w:tcMar>
+              <w:top w:type="dxa" w:w="70"/>
+              <w:left w:type="dxa" w:w="100"/>
+              <w:bottom w:type="dxa" w:w="70"/>
+              <w:right w:type="dxa" w:w="100"/>
+            </w:tcMar>
+          </w:tcPr>
+          <w:p>
+            <w:r>
+              <w:rPr>
+                <w:rFonts w:ascii="Arial" w:cs="Arial" w:eastAsia="Arial" w:hAnsi="Arial"/>
+                <w:sz w:val="17"/>
+                <w:szCs w:val="17"/>
+              </w:rPr>
+              <w:t xml:space="preserve">What do you need? · How big is the space? · Any tall trees near power lines or buildings? · Is there a water source on site? · How often?</w:t>
+            </w:r>
+          </w:p>
+        </w:tc>
+      </w:tr>
+      <w:tr>
+        <w:tc>
+          <w:tcPr>
+            <w:tcW w:type="dxa" w:w="15476"/>
+            <w:gridSpan w:val="3"/>
+            <w:tcBorders>
+              <w:top w:val="single" w:color="B5B5B5" w:sz="4"/>
+              <w:left w:val="none" w:color="FFFFFF" w:sz="0"/>
+              <w:bottom w:val="single" w:color="B5B5B5" w:sz="4"/>
+              <w:right w:val="none" w:color="FFFFFF" w:sz="0"/>
+            </w:tcBorders>
+            <w:tcMar>
+              <w:top w:type="dxa" w:w="70"/>
+              <w:left w:type="dxa" w:w="100"/>
+              <w:bottom w:type="dxa" w:w="70"/>
+              <w:right w:type="dxa" w:w="100"/>
+            </w:tcMar>
+          </w:tcPr>
+          <w:p>
+            <w:r>
+              <w:rPr>
+                <w:rFonts w:ascii="Arial" w:cs="Arial" w:eastAsia="Arial" w:hAnsi="Arial"/>
+                <w:b/>
+                <w:bCs/>
+                <w:sz w:val="19"/>
+                <w:szCs w:val="19"/>
+              </w:rPr>
+              <w:t xml:space="preserve">Anything else</w:t>
+            </w:r>
+          </w:p>
+        </w:tc>
+      </w:tr>
+      <w:tr>
+        <w:trPr>
+          <w:cantSplit/>
+        </w:trPr>
+        <w:tc>
+          <w:tcPr>
+            <w:tcW w:type="dxa" w:w="2900"/>
+            <w:tcBorders>
+              <w:top w:val="single" w:color="B5B5B5" w:sz="4"/>
+              <w:left w:val="none" w:color="FFFFFF" w:sz="0"/>
+              <w:bottom w:val="single" w:color="B5B5B5" w:sz="4"/>
+              <w:right w:val="none" w:color="FFFFFF" w:sz="0"/>
+            </w:tcBorders>
+            <w:tcMar>
+              <w:top w:type="dxa" w:w="70"/>
+              <w:left w:type="dxa" w:w="100"/>
+              <w:bottom w:type="dxa" w:w="70"/>
+              <w:right w:type="dxa" w:w="100"/>
+            </w:tcMar>
+          </w:tcPr>
+          <w:p>
+            <w:r>
+              <w:rPr>
+                <w:rFonts w:ascii="Arial" w:cs="Arial" w:eastAsia="Arial" w:hAnsi="Arial"/>
+                <w:b/>
+                <w:bCs/>
+                <w:sz w:val="18"/>
+                <w:szCs w:val="18"/>
+              </w:rPr>
+              <w:t xml:space="preserve">Other</w:t>
+            </w:r>
+          </w:p>
+        </w:tc>
+        <w:tc>
+          <w:tcPr>
+            <w:tcW w:type="dxa" w:w="5500"/>
+            <w:tcBorders>
+              <w:top w:val="single" w:color="B5B5B5" w:sz="4"/>
+              <w:left w:val="none" w:color="FFFFFF" w:sz="0"/>
+              <w:bottom w:val="single" w:color="B5B5B5" w:sz="4"/>
+              <w:right w:val="none" w:color="FFFFFF" w:sz="0"/>
+            </w:tcBorders>
+            <w:tcMar>
+              <w:top w:type="dxa" w:w="70"/>
+              <w:left w:type="dxa" w:w="100"/>
+              <w:bottom w:type="dxa" w:w="70"/>
+              <w:right w:type="dxa" w:w="100"/>
+            </w:tcMar>
+          </w:tcPr>
+          <w:p>
+            <w:r>
+              <w:rPr>
+                <w:rFonts w:ascii="Arial" w:cs="Arial" w:eastAsia="Arial" w:hAnsi="Arial"/>
+                <w:sz w:val="17"/>
+                <w:szCs w:val="17"/>
+              </w:rPr>
+              <w:t xml:space="preserve">Not on the list? Describe what you need and we find the right person.</w:t>
+            </w:r>
+          </w:p>
+        </w:tc>
+        <w:tc>
+          <w:tcPr>
+            <w:tcW w:type="dxa" w:w="7076"/>
+            <w:tcBorders>
+              <w:top w:val="single" w:color="B5B5B5" w:sz="4"/>
+              <w:left w:val="none" w:color="FFFFFF" w:sz="0"/>
+              <w:bottom w:val="single" w:color="B5B5B5" w:sz="4"/>
+              <w:right w:val="none" w:color="FFFFFF" w:sz="0"/>
+            </w:tcBorders>
+            <w:tcMar>
+              <w:top w:type="dxa" w:w="70"/>
+              <w:left w:type="dxa" w:w="100"/>
+              <w:bottom w:type="dxa" w:w="70"/>
+              <w:right w:type="dxa" w:w="100"/>
+            </w:tcMar>
+          </w:tcPr>
+          <w:p>
+            <w:r>
+              <w:rPr>
+                <w:rFonts w:ascii="Arial" w:cs="Arial" w:eastAsia="Arial" w:hAnsi="Arial"/>
+                <w:sz w:val="17"/>
+                <w:szCs w:val="17"/>
+              </w:rPr>
+              <w:t xml:space="preserve">What do you need?</w:t>
+            </w:r>
+          </w:p>
+        </w:tc>
+      </w:tr>
+    </w:tbl>
     <w:sectPr>
       <w:pgSz w:w="16838" w:h="11906" w:orient="landscape"/>
       <w:pgMar w:top="680" w:right="680" w:bottom="680" w:left="680" w:header="708" w:footer="708" w:gutter="0"/>

</xml_diff>